<commit_message>
docs(eva-02): redefine C-05 como chatbot FAQ y canal de soporte
Alinea el cambio con ahorro de personal de soporte contratado, sin abrir app ciudadana ni reemplazo total del técnico.
</commit_message>
<xml_diff>
--- a/evaluaciones/eva-02/informe/2.2.2-Gestion-de-cambios-Kiran.docx
+++ b/evaluaciones/eva-02/informe/2.2.2-Gestion-de-cambios-Kiran.docx
@@ -1066,7 +1066,7 @@
           <w:i w:val="0"/>
           <w:sz w:val="24"/>
         </w:rPr>
-        <w:t>C-05 y C-06 no suman encima de la fotografía, el segundo punto de inventario y el servicio externo: compiten por las mismas dos tarjetas por persona. Si entra uno, sale una historia equivalente del sprint. La contingencia del 12 % sigue cerrada sin razón escrita. Un datalake completo, un modelo hospedado por el equipo o una IA para hogares y donantes no entran en esta ventana: o se cierran, o quedan como solicitud futura fuera del piloto.</w:t>
+        <w:t>C-05 y C-06 no suman encima de la fotografía, el segundo punto de inventario y el servicio externo: compiten por las mismas dos tarjetas por persona. Si entra uno, sale una historia equivalente del sprint. La contingencia del 12 % sigue cerrada sin razón escrita. Un datalake completo, un modelo hospedado por el equipo, una app ciudadana masiva o un chatbot que reemplace por completo al soporte contratado no entran en esta ventana: o se cierran, o quedan como solicitud futura fuera del piloto. C-05 fase 1 es autoservicio de FAQ y canal de asistencia para usuarios de la plataforma, no un segundo producto.</w:t>
       </w:r>
     </w:p>
     <w:p>
@@ -1819,7 +1819,7 @@
               <w:jc w:val="left"/>
             </w:pPr>
             <w:r>
-              <w:t>Ejemplo de solicitud. La dirección pide un asistente de IA de uso interno para tickets, reportes y decisiones. En este plan la formulación completa no se aprueba: solo se contempla la fase 1 (resumen de ticket, checklist de terreno y sugerencia del siguiente ticket en cola, con confirmación humana), tras un tablero usable y sin enviar datos de hogares a un modelo externo.</w:t>
+              <w:t>Ejemplo de solicitud. La dirección pide un chatbot en la plataforma para los usuarios del piloto: preguntas frecuentes (FAQ) y un canal para comunicarse por temas de soporte y asistencia, con el fin de ahorrar contrato de personal de soporte. En este plan la formulación amplia (app ciudadana masiva o reemplazo total del técnico) no se aprueba: solo se contempla la fase 1 (FAQ publicadas en el chat más escalamiento a ticket o a persona de soporte cuando el FAQ no alcanza), tras un tablero usable, sin datos de hogares en un modelo externo y sin sustituir los estados del kit.</w:t>
             </w:r>
             <w:r>
               <w:rPr>
@@ -1849,7 +1849,7 @@
               <w:jc w:val="left"/>
             </w:pPr>
             <w:r>
-              <w:t>Dirección / equipo</w:t>
+              <w:t>Dirección / equipo (ahorro de personal de soporte)</w:t>
             </w:r>
             <w:r>
               <w:rPr>
@@ -1879,7 +1879,7 @@
               <w:jc w:val="left"/>
             </w:pPr>
             <w:r>
-              <w:t>9 de noviembre (depende del tablero) y 4 de diciembre (tickets). No la ruta crítica de inventario.</w:t>
+              <w:t>9 de noviembre (depende del tablero usable) y 4 de diciembre (tickets y canal). No la ruta crítica de inventario.</w:t>
             </w:r>
             <w:r>
               <w:rPr>
@@ -2100,7 +2100,7 @@
           <w:i w:val="0"/>
           <w:sz w:val="24"/>
         </w:rPr>
-        <w:t>C-05 se rotula como ejemplo de solicitud porque concreta el tipo de cambio de productividad con IA que el piloto puede recibir. No es un copiloto ya construido. Lo que amerita registro es la ampliación de superficie de producto y el costo variable de una API de modelo. La medida factible, si cabe, es solo la fase 1 de soporte.</w:t>
+        <w:t>C-05 se rotula como ejemplo de solicitud porque concreta el tipo de cambio de soporte al usuario con IA que el piloto puede recibir: un chatbot con FAQ y canal de asistencia para bajar el gasto en personal de soporte contratado. No es una app ciudadana ni el reemplazo total del técnico. Lo que amerita registro es la nueva superficie en la plataforma y el costo variable de una API de modelo. La medida factible, si cabe, es solo la fase 1 (FAQ más escalamiento humano).</w:t>
       </w:r>
     </w:p>
     <w:p>
@@ -2184,7 +2184,7 @@
           <w:i w:val="0"/>
           <w:sz w:val="24"/>
         </w:rPr>
-        <w:t>Cada cambio se examina en cronograma, alcance, costo y calidad, con el efecto positivo y el negativo. El costo no se expresa en una cifra nueva: el techo sigue en US$ 20.700 y este plan no autoriza la contingencia. El tiempo se lee contra los cortes ya comprometidos. La calidad se lee con las reglas ya definidas: defectos del período sobre líneas cambiadas, con meta de 5 o menos y cero bloqueos abiertos; la celda queda «sin base» cuando no hay código, y esa celda no es alerta roja; la reapertura es lo reabierto sobre lo cerrado, con meta bajo el 20 %; el atraso de un hito se acepta hasta tres días si la causa queda escrita, y si pasa de eso la semana siguiente no agrega trabajo; Ari registra el gasto cada dos semanas y una desviación sobre el 10 % detiene el gasto no comprometido; la contraparte se puntúa de 1 a 5 en cada corte, y bajo 4 el corte se reabre. Para C-05 y C-06 el examen incluye también esfuerzo del sprint, rendimiento del piloto y del equipo, recursos de infraestructura e indicadores estratégicos (E) y operativos (O). El seguimiento de techo corresponde al indicador estratégico E4. El sobre de API de IA, si C-05b entra, se registra como subítem del costo variable; si la desviación supera el 10 %, se detiene ese gasto antes que otras funciones del corte.</w:t>
+        <w:t>Cada cambio se examina en cronograma, alcance, costo y calidad, con el efecto positivo y el negativo. El costo no se expresa en una cifra nueva: el techo sigue en US$ 20.700 y este plan no autoriza la contingencia. El tiempo se lee contra los cortes ya comprometidos. La calidad se lee con las reglas ya definidas: defectos del período sobre líneas cambiadas, con meta de 5 o menos y cero bloqueos abiertos; la celda queda «sin base» cuando no hay código, y esa celda no es alerta roja; la reapertura es lo reabierto sobre lo cerrado, con meta bajo el 20 %; el atraso de un hito se acepta hasta tres días si la causa queda escrita, y si pasa de eso la semana siguiente no agrega trabajo; Ari registra el gasto cada dos semanas y una desviación sobre el 10 % detiene el gasto no comprometido; la contraparte se puntúa de 1 a 5 en cada corte, y bajo 4 el corte se reabre. Para C-05 y C-06 el examen incluye también esfuerzo del sprint, rendimiento del piloto y del equipo, recursos de infraestructura e indicadores estratégicos (E) y operativos (O). El seguimiento de techo corresponde al indicador estratégico E4. El sobre de API del chatbot, si C-05b entra, se registra como subítem del costo variable; si la desviación supera el 10 %, se detiene ese gasto antes que otras funciones del corte.</w:t>
       </w:r>
     </w:p>
     <w:p>
@@ -2408,7 +2408,7 @@
           <w:i w:val="0"/>
           <w:sz w:val="24"/>
         </w:rPr>
-        <w:t>2.5. C-05. Asistente de IA de uso interno</w:t>
+        <w:t>2.5. C-05. Chatbot de FAQ y canal de soporte</w:t>
       </w:r>
     </w:p>
     <w:p>
@@ -2424,7 +2424,7 @@
           <w:i w:val="0"/>
           <w:sz w:val="24"/>
         </w:rPr>
-        <w:t>En los términos pedidos (copiloto para tickets, reportes y decisiones), el cambio toca integración, costo variable de API, privacidad y calidad de las sugerencias. Nicolás sostiene la integración. Skarlett valida la calidad de lo sugerido. Ari registra el tope de gasto. Giannina sostiene el control de cambios. Un modelo propio, un fine-tuning o un datalake para entrenar no están en el plan.</w:t>
+        <w:t>En los términos pedidos (chatbot para usuarios con FAQ y comunicación de soporte, para ahorrar contrato de personal), el cambio toca la interfaz de la plataforma, integración con una API de modelo o motor de FAQ, privacidad, calidad de las respuestas y el flujo hacia el ticket. Nicolás sostiene la integración. Giannina la interfaz del chat. Skarlett valida la calidad de las respuestas y el FAQ. Ari registra el tope de gasto. Un modelo propio, un fine-tuning, un datalake para entrenar o una app para cada hogar no están en el plan.</w:t>
       </w:r>
     </w:p>
     <w:p>
@@ -2440,7 +2440,7 @@
           <w:i w:val="0"/>
           <w:sz w:val="24"/>
         </w:rPr>
-        <w:t>El efecto positivo acotado es aliviar al técnico a 0,4 FTE: menos tiempo para entender un ticket y elegir el siguiente, si la sugerencia se usa y se corrige. El efecto negativo de la formulación completa es ampliar el alcance, abrir gasto no comprometido y priorizar mal por una alucinación. La fase 1 no cambia el estado del kit ni redacta el reporte a donantes. Indicadores amenazados: E1, E4 y E5. Operativos a monitorear: O1, O4 y O6, con submetricas de adopción y rechazo de sugerencias.</w:t>
+        <w:t>El efecto positivo acotado es reducir consultas repetidas al personal de soporte contratado: el usuario resuelve con FAQ o deja un mensaje que escala a ticket. El efecto negativo de la formulación completa (reemplazo total del soporte o app ciudadana) es ampliar el alcance, abrir gasto no comprometido y responder mal por una alucinación. La fase 1 no cambia el estado del kit, no cierra tickets sola y no redacta el reporte a donantes. Indicadores amenazados: E1, E4 y E5. Operativos a monitorear: O1, O4 y O6, con submétricas de contención del chatbot (% resuelto por FAQ sin escalar) y de escalamiento a persona.</w:t>
       </w:r>
     </w:p>
     <w:p>
@@ -2488,7 +2488,7 @@
           <w:i w:val="0"/>
           <w:sz w:val="24"/>
         </w:rPr>
-        <w:t>El efecto positivo es bajar el costo de soporte informal. El efecto negativo es presión de esfuerzo hacia el 9 de noviembre y más líneas cambiadas antes del 4 de diciembre, con riesgo sobre O1 y, si persiste, sobre E1. El orden de adopción es C-06 antes que la IA fase 1: la IA no adelanta a un tablero que el soporte aún no usa.</w:t>
+        <w:t>El efecto positivo es bajar el costo de soporte informal. El efecto negativo es presión de esfuerzo hacia el 9 de noviembre y más líneas cambiadas antes del 4 de diciembre, con riesgo sobre O1 y, si persiste, sobre E1. El orden de adopción es C-06 (cola visible para quien atiende) antes que el chatbot fase 1: el canal de asistencia no adelanta a un tablero y una cola que el soporte aún no usa.</w:t>
       </w:r>
     </w:p>
     <w:p>
@@ -2520,7 +2520,7 @@
           <w:i w:val="0"/>
           <w:sz w:val="24"/>
         </w:rPr>
-        <w:t>Aceptar a la vez la fotografía de C-01, el segundo punto de C-02 y el servicio de C-03 no son tres mejoras independientes. Las tres caen sobre los mismos cortes y sobre el mismo techo. El 19 de octubre condiciona el 9 de noviembre. El 4 de diciembre concentra tickets, pruebas y reporte, y la semana siguiente es de cierre. El equipo tiene cuatro roles y dos tarjetas por persona. La situación compleja del caso no es un cambio aislado: es la suma. El plan inicial se mantiene si entra, como máximo, la medida reducida de C-01 y la regla de C-04. Las otras dos solicitudes quedan en el registro precisamente para que no reaparezcan como trabajo informal. Aceptar además un datalake completo y un copiloto de IA «todo en uno» no son mejoras independientes: caen sobre el mismo techo, el mismo equipo y los mismos cortes. Un datalake o lakehouse (ingesta, catálogo, ETL, BI dedicado) queda fuera del 100 % de la EDT del piloto: se rechaza o se difiere post cierre. La línea base de datos sigue siendo la base del aplicativo más el export para el reporte del 4 de diciembre. Un depósito mínimo de logs agregados sin PII, si alguien lo pide, solo cabe condicionado y dentro del hosting variable, sin competir con C-06. C-05 fase 1 y C-06 solo entran si reemplazan historia y respetan dos tarjetas por persona. Hay que evitar acumular superficie de producto sin capacidad de integración y prueba.</w:t>
+        <w:t>Aceptar a la vez la fotografía de C-01, el segundo punto de C-02 y el servicio de C-03 no son tres mejoras independientes. Las tres caen sobre los mismos cortes y sobre el mismo techo. El 19 de octubre condiciona el 9 de noviembre. El 4 de diciembre concentra tickets, pruebas y reporte, y la semana siguiente es de cierre. El equipo tiene cuatro roles y dos tarjetas por persona. La situación compleja del caso no es un cambio aislado: es la suma. El plan inicial se mantiene si entra, como máximo, la medida reducida de C-01 y la regla de C-04. Las otras dos solicitudes quedan en el registro precisamente para que no reaparezcan como trabajo informal. Aceptar además un datalake completo y un copiloto de IA «todo en uno» no son mejoras independientes: caen sobre el mismo techo, el mismo equipo y los mismos cortes. Un datalake o lakehouse (ingesta, catálogo, ETL, BI dedicado) queda fuera del 100 % de la EDT del piloto: se rechaza o se difiere post cierre. La línea base de datos sigue siendo la base del aplicativo más el export para el reporte del 4 de diciembre. Un depósito mínimo de logs agregados sin PII, si alguien lo pide, solo cabe condicionado y dentro del hosting variable, sin competir con C-06. C-05 fase 1 (chatbot FAQ + canal) y C-06 solo entran si reemplazan historia y respetan dos tarjetas por persona. Hay que evitar acumular superficie de producto sin capacidad de integración y prueba.</w:t>
       </w:r>
     </w:p>
     <w:p>
@@ -3320,7 +3320,7 @@
               <w:jc w:val="left"/>
             </w:pPr>
             <w:r>
-              <w:t>C-05 completo (copiloto / datalake / modelo propio)</w:t>
+              <w:t>C-05 completo (app ciudadana / reemplazo total / datalake)</w:t>
             </w:r>
             <w:r>
               <w:rPr>
@@ -3350,7 +3350,7 @@
               <w:jc w:val="left"/>
             </w:pPr>
             <w:r>
-              <w:t>Alto. Abre plataforma de datos o IA fuera de la EDT.</w:t>
+              <w:t>Alto. Abre app masiva o elimina el soporte humano del piloto sin capacidad de integración.</w:t>
             </w:r>
             <w:r>
               <w:rPr>
@@ -3380,7 +3380,7 @@
               <w:jc w:val="left"/>
             </w:pPr>
             <w:r>
-              <w:t>Gasto variable y posible contingencia. Rompe E4 si supera el 10 % de desviación.</w:t>
+              <w:t>Gasto variable alto y posible contingencia. Rompe E4 si supera el 10 % de desviación.</w:t>
             </w:r>
             <w:r>
               <w:rPr>
@@ -3475,7 +3475,7 @@
               <w:jc w:val="left"/>
             </w:pPr>
             <w:r>
-              <w:t>C-05 fase 1 (soporte)</w:t>
+              <w:t>C-05 fase 1 (chatbot FAQ + canal)</w:t>
             </w:r>
             <w:r>
               <w:rPr>
@@ -3505,7 +3505,7 @@
               <w:jc w:val="left"/>
             </w:pPr>
             <w:r>
-              <w:t>Medio. Integra API y prompts acotados; el humano confirma.</w:t>
+              <w:t>Medio. Chat en la plataforma con FAQ y escalamiento a ticket o persona; no cierra solo.</w:t>
             </w:r>
             <w:r>
               <w:rPr>
@@ -3535,7 +3535,7 @@
               <w:jc w:val="left"/>
             </w:pPr>
             <w:r>
-              <w:t>Horas replanificadas más sobre API dentro del costo variable. Contingencia cerrada salvo razón escrita.</w:t>
+              <w:t>Horas replanificadas más sobre API o hosting del chat dentro del costo variable. Contingencia cerrada salvo razón escrita. Objetivo: menos horas de soporte contratado.</w:t>
             </w:r>
             <w:r>
               <w:rPr>
@@ -3595,7 +3595,7 @@
               <w:jc w:val="left"/>
             </w:pPr>
             <w:r>
-              <w:t>Condicionado a C-06 o C-01b, cupo de sprint y tope de API.</w:t>
+              <w:t>Condicionado a C-06, cupo de sprint, tope de API y FAQ curado por el equipo.</w:t>
             </w:r>
             <w:r>
               <w:rPr>
@@ -4473,7 +4473,7 @@
               <w:jc w:val="left"/>
             </w:pPr>
             <w:r>
-              <w:t>La IA amplía el alcance sin control.</w:t>
+              <w:t>El chatbot amplía el alcance sin control.</w:t>
             </w:r>
             <w:r>
               <w:rPr>
@@ -4503,7 +4503,7 @@
               <w:jc w:val="left"/>
             </w:pPr>
             <w:r>
-              <w:t>Se construye un copiloto, auto-estados o un reporte a donantes sin fila nueva.</w:t>
+              <w:t>Se construye app ciudadana, se elimina el soporte contratado de golpe o el bot cierra tickets y cambia estados solo.</w:t>
             </w:r>
             <w:r>
               <w:rPr>
@@ -4533,7 +4533,7 @@
               <w:jc w:val="left"/>
             </w:pPr>
             <w:r>
-              <w:t>Solo fase 1 asistida. Un salto de fase es solicitud nueva. El análisis de impacto lo revisa un rol senior (Ari o Nicolás), no un junior en planificación ni en control de cambios.</w:t>
+              <w:t>Solo fase 1: FAQ más escalamiento humano. Un salto de fase es solicitud nueva. El análisis de impacto lo revisa un rol senior (Ari o Nicolás), no un junior en planificación ni en control de cambios.</w:t>
             </w:r>
             <w:r>
               <w:rPr>
@@ -4598,7 +4598,7 @@
               <w:jc w:val="left"/>
             </w:pPr>
             <w:r>
-              <w:t>Se contrata un lago completo o se abre la contingencia sin acta.</w:t>
+              <w:t>Se contrata un lago completo, un modelo propio o se abre la contingencia sin acta por el chatbot.</w:t>
             </w:r>
             <w:r>
               <w:rPr>
@@ -4628,7 +4628,7 @@
               <w:jc w:val="left"/>
             </w:pPr>
             <w:r>
-              <w:t>El datalake completo se rechaza o se difiere. Ari pone tope de API en Excel. Si la desviación supera el 10 %, se pausa la IA antes que el corte.</w:t>
+              <w:t>El datalake completo y la app ciudadana se rechazan o se difieren. Ari pone tope de API del chatbot en Excel. Si la desviación supera el 10 %, se pausa el chatbot antes que el corte.</w:t>
             </w:r>
             <w:r>
               <w:rPr>
@@ -4966,7 +4966,7 @@
           <w:i w:val="0"/>
           <w:sz w:val="24"/>
         </w:rPr>
-        <w:t>C-05 se aprueba solo por fases. La fase 1 (soporte) queda condicionada a que C-06 y, si aplica, C-01b estén en marcha o en el mismo plan de sprint, a que quepa en dos tarjetas por persona y a un tope de llamadas API en Excel. La fase 2 (borradores internos de cierre) solo post 4 de diciembre o con un control de cambios nuevo. La fase 3 (copiloto amplio, priorización automática, IA a hogares o donantes, modelo propio) se rechaza entre septiembre y diciembre de 2026. No se aprueba un copiloto único «todo en uno».</w:t>
+        <w:t>C-05 se aprueba solo por fases. La fase 1 (chatbot con FAQ y canal de asistencia que escala a ticket o a persona) queda condicionada a que C-06 esté en marcha o en el mismo plan de sprint, a que quepa en dos tarjetas por persona y a un tope de llamadas API en Excel. El FAQ lo cura el equipo; el chatbot no cierra ni cambia estados solo. La fase 2 (ampliar el corpus FAQ y mejorar el enrutamiento del canal) solo post 4 de diciembre o con un control de cambios nuevo. La fase 3 (reemplazo total del personal de soporte, app ciudadana masiva, modelo propio) se rechaza entre septiembre y diciembre de 2026. No se aprueba un chatbot que sustituya de golpe al soporte contratado.</w:t>
       </w:r>
     </w:p>
     <w:p>
@@ -4982,7 +4982,7 @@
           <w:i w:val="0"/>
           <w:sz w:val="24"/>
         </w:rPr>
-        <w:t>C-06 se aprueba en forma condicionada: vistas de cola o filtro en el tablero hacia el 9 de noviembre, sin aprendizaje automático, midiendo menos consultas informales. Es prerrequisito de la IA fase 1. Si no cabe en el límite de trabajo en curso, no entra.</w:t>
+        <w:t>C-06 se aprueba en forma condicionada: vistas de cola o filtro en el tablero hacia el 9 de noviembre, sin aprendizaje automático, midiendo menos consultas informales. Es prerrequisito del chatbot fase 1: lo que escale desde el chat debe poder atenderse en la cola. Si no cabe en el límite de trabajo en curso, no entra.</w:t>
       </w:r>
     </w:p>
     <w:p>
@@ -6108,7 +6108,7 @@
               <w:jc w:val="left"/>
             </w:pPr>
             <w:r>
-              <w:t>C-05 fase 1</w:t>
+              <w:t>C-05 fase 1, chatbot FAQ + canal</w:t>
             </w:r>
             <w:r>
               <w:rPr>
@@ -6137,7 +6137,7 @@
               <w:jc w:val="left"/>
             </w:pPr>
             <w:r>
-              <w:t>Sí para el soporte, no antes que la cola.</w:t>
+              <w:t>Sí para bajar carga de personal de soporte, no antes que la cola de atención.</w:t>
             </w:r>
             <w:r>
               <w:rPr>
@@ -6224,7 +6224,7 @@
               <w:jc w:val="left"/>
             </w:pPr>
             <w:r>
-              <w:t>Después de C-06. Condicionada al cupo y al tope de API.</w:t>
+              <w:t>Después de C-06. Condicionada al cupo, al tope de API y al FAQ curado.</w:t>
             </w:r>
             <w:r>
               <w:rPr>
@@ -6258,7 +6258,7 @@
               <w:jc w:val="left"/>
             </w:pPr>
             <w:r>
-              <w:t>C-05 fases 2–3 / datalake completo</w:t>
+              <w:t>C-05 fases 2–3 / app ciudadana / datalake completo</w:t>
             </w:r>
             <w:r>
               <w:rPr>
@@ -7395,7 +7395,7 @@
               <w:jc w:val="left"/>
             </w:pPr>
             <w:r>
-              <w:t>Aprobada condicionada a C-06 o C-01b, al límite de dos tarjetas y al tope de API. Las fases 2 y 3 no.</w:t>
+              <w:t>Aprobada condicionada a C-06, al límite de dos tarjetas, al tope de API y a un FAQ curado. Las fases 2 y 3 no. El bot no cierra ni cambia estados solo.</w:t>
             </w:r>
             <w:r>
               <w:rPr>
@@ -7424,7 +7424,7 @@
               <w:jc w:val="left"/>
             </w:pPr>
             <w:r>
-              <w:t>Apoya los tickets sin abrir un producto nuevo ni un reporte automático a donantes.</w:t>
+              <w:t>Ofrece autoservicio y canal de asistencia a usuarios de la plataforma para ahorrar personal de soporte, sin abrir app ciudadana ni reporte automático a donantes.</w:t>
             </w:r>
             <w:r>
               <w:rPr>
@@ -7482,7 +7482,7 @@
               <w:jc w:val="left"/>
             </w:pPr>
             <w:r>
-              <w:t>Sí, a la dirección, si proponen mover el 4 de diciembre o abrir la contingencia por API.</w:t>
+              <w:t>Sí, a la dirección, si proponen mover el 4 de diciembre, abrir la contingencia por API o reemplazar de golpe al soporte contratado.</w:t>
             </w:r>
             <w:r>
               <w:rPr>
@@ -7516,7 +7516,7 @@
               <w:jc w:val="left"/>
             </w:pPr>
             <w:r>
-              <w:t>C-05 completo / datalake</w:t>
+              <w:t>C-05 completo / app ciudadana / datalake</w:t>
             </w:r>
             <w:r>
               <w:rPr>
@@ -7574,7 +7574,7 @@
               <w:jc w:val="left"/>
             </w:pPr>
             <w:r>
-              <w:t>El piloto usa la base del aplicativo y el export; no un segundo producto de datos.</w:t>
+              <w:t>El piloto no abre una app masiva ni un segundo producto de datos; el soporte humano sigue existiendo para lo que el FAQ no resuelve.</w:t>
             </w:r>
             <w:r>
               <w:rPr>
@@ -7632,7 +7632,7 @@
               <w:jc w:val="left"/>
             </w:pPr>
             <w:r>
-              <w:t>Sí, a la dirección, si se insiste en un lago o en un modelo propio.</w:t>
+              <w:t>Sí, a la dirección, si se insiste en app ciudadana, lago o modelo propio.</w:t>
             </w:r>
             <w:r>
               <w:rPr>
@@ -8821,7 +8821,7 @@
               <w:jc w:val="left"/>
             </w:pPr>
             <w:r>
-              <w:t>C-05 fase 1, condicionada</w:t>
+              <w:t>C-05 fase 1, chatbot condicionada</w:t>
             </w:r>
             <w:r>
               <w:rPr>
@@ -8851,7 +8851,7 @@
               <w:jc w:val="left"/>
             </w:pPr>
             <w:r>
-              <w:t>Se agrega integración de API, prompts acotados y registros de uso internos. Esfuerzo orientativo: cuatro a seis días-persona de integración y dos a tres de calidad.</w:t>
+              <w:t>Se agrega chatbot en la plataforma: corpus FAQ, ventana de chat y escalamiento a ticket o a persona de soporte. Esfuerzo orientativo: cuatro a seis días-persona de integración y dos a tres de calidad del FAQ. No cambia estados del kit solo.</w:t>
             </w:r>
             <w:r>
               <w:rPr>
@@ -8881,7 +8881,7 @@
               <w:jc w:val="left"/>
             </w:pPr>
             <w:r>
-              <w:t>Las tareas quedan bajo el paquete de tickets. La predecesora es el tablero usable. No se construye en la semana del 5 al 9 de diciembre.</w:t>
+              <w:t>Las tareas quedan bajo el paquete de tickets y soporte. La predecesora es el tablero usable. No se construye en la semana del 5 al 9 de diciembre.</w:t>
             </w:r>
             <w:r>
               <w:rPr>
@@ -8941,7 +8941,7 @@
               <w:jc w:val="left"/>
             </w:pPr>
             <w:r>
-              <w:t>Ari registra un subítem de sobre API de IA dentro del costo variable. Tope mensual escrito. Contingencia del 12 % cerrada. Desviación sobre el 10 %: se pausa la IA.</w:t>
+              <w:t>Ari registra un subítem de sobre API del chatbot dentro del costo variable. Tope mensual escrito. Contingencia del 12 % cerrada. Desviación sobre el 10 %: se pausa el chatbot. El ahorro esperado es de horas de soporte contratado, no un segundo techo.</w:t>
             </w:r>
             <w:r>
               <w:rPr>
@@ -8976,7 +8976,7 @@
               <w:jc w:val="left"/>
             </w:pPr>
             <w:r>
-              <w:t>C-05 amplio / datalake, cerrado</w:t>
+              <w:t>C-05 amplio / app ciudadana / datalake, cerrado</w:t>
             </w:r>
             <w:r>
               <w:rPr>
@@ -10111,7 +10111,7 @@
               <w:jc w:val="left"/>
             </w:pPr>
             <w:r>
-              <w:t>Tras el tablero usable, decidir si entra C-05 fase 1: cupo de dos tarjetas, tope de API de Ari y revisión con el soporte.</w:t>
+              <w:t>Tras el tablero usable, decidir si entra C-05 fase 1 (chatbot FAQ + canal): cupo de dos tarjetas, tope de API de Ari, FAQ curado y Review con quien da soporte.</w:t>
             </w:r>
             <w:r>
               <w:rPr>
@@ -10141,7 +10141,7 @@
               <w:jc w:val="left"/>
             </w:pPr>
             <w:r>
-              <w:t>Giannina Guerrero (control de cambios); Nicolás Barra (integración); Skarlett Tropan (calidad de sugerencias); Ari Araya (gasto)</w:t>
+              <w:t>Giannina Guerrero (control de cambios e interfaz del chat); Nicolás Barra (integración); Skarlett Tropan (calidad del FAQ y respuestas); Ari Araya (gasto)</w:t>
             </w:r>
             <w:r>
               <w:rPr>
@@ -10206,7 +10206,7 @@
               <w:jc w:val="left"/>
             </w:pPr>
             <w:r>
-              <w:t>Medir, bajo el indicador O6, el porcentaje de tickets con resumen o checklist usado y el porcentaje de sugerencias rechazadas. Si el rechazo es alto, congelar la fase 2.</w:t>
+              <w:t>Medir, bajo el indicador O6, el porcentaje de consultas contenidas por FAQ sin escalar y el porcentaje que escala a ticket o a persona. Si la contención es baja o hay alucinaciones, congelar la fase 2.</w:t>
             </w:r>
             <w:r>
               <w:rPr>
@@ -10301,7 +10301,7 @@
               <w:jc w:val="left"/>
             </w:pPr>
             <w:r>
-              <w:t>No abrir la fase 2 de IA ni un datalake completo sin un control de cambios nuevo y revisión de un rol senior.</w:t>
+              <w:t>No abrir la fase 2 del chatbot, ni app ciudadana, ni un datalake completo sin un control de cambios nuevo y revisión de un rol senior.</w:t>
             </w:r>
             <w:r>
               <w:rPr>
@@ -10776,7 +10776,7 @@
               <w:jc w:val="left"/>
             </w:pPr>
             <w:r>
-              <w:t>Puede entrar C-06 (cola o filtros), solo a cambio de otra historia. No entra un datalake. No entra C-05 fase 1 antes del tablero usable.</w:t>
+              <w:t>Puede entrar C-06 (cola o filtros), solo a cambio de otra historia. No entra un datalake ni una app ciudadana. No entra C-05 fase 1 (chatbot) antes del tablero usable.</w:t>
             </w:r>
             <w:r>
               <w:rPr>
@@ -10894,7 +10894,7 @@
               <w:jc w:val="left"/>
             </w:pPr>
             <w:r>
-              <w:t>Puede entrar la prioridad y la nota, y C-05 fase 1 si cumplió condiciones, solo a cambio de otra historia. No entra el archivo. No entra un servicio externo. No entra la fase 2 de IA ni un datalake.</w:t>
+              <w:t>Puede entrar la prioridad y la nota, y C-05 fase 1 (chatbot FAQ + canal de asistencia) si cumplió condiciones, solo a cambio de otra historia. No entra el archivo. No entra un servicio externo. No entra la fase 2 del chatbot ni un datalake ni una app ciudadana.</w:t>
             </w:r>
             <w:r>
               <w:rPr>
@@ -11348,7 +11348,7 @@
           <w:i w:val="0"/>
           <w:sz w:val="24"/>
         </w:rPr>
-        <w:t>E4. Techo y gasto comprometido: desviación acumulada frente a US$ 20.700. Freno si supera el 10 %. Dueño: Ari. Si se rompe: detener gasto no comprometido, incluida la API de IA.</w:t>
+        <w:t>E4. Techo y gasto comprometido: desviación acumulada frente a US$ 20.700. Freno si supera el 10 %. Dueño: Ari. Si se rompe: detener gasto no comprometido, incluida la API del chatbot.</w:t>
       </w:r>
     </w:p>
     <w:p>
@@ -11476,7 +11476,7 @@
           <w:i w:val="0"/>
           <w:sz w:val="24"/>
         </w:rPr>
-        <w:t>O6. Atención de fallas: tiempo medio desde kit en falla hasta ticket asignado, tiempo para elegir el siguiente ticket y porcentaje de consultas fuera del tablero. Meta: mejorar después del 9 de noviembre. Submetricas de C-05: porcentaje de tickets con resumen o checklist usado y porcentaje de sugerencias rechazadas; rechazo alto congela la fase 2. Dueños: Giannina y el soporte; en IA, Nicolás y Skarlett.</w:t>
+        <w:t>O6. Atención de fallas: tiempo medio desde kit en falla hasta ticket asignado, tiempo para elegir el siguiente ticket y porcentaje de consultas fuera del tablero. Meta: mejorar después del 9 de noviembre. Submétricas de C-05: porcentaje de consultas del chatbot contenidas por FAQ sin escalar; porcentaje que escala a ticket o a persona; calidad percibida del FAQ (revisión de Skarlett). Contención baja o alucinaciones altas congelan la fase 2. Dueños: Giannina y el soporte; en el chatbot, Nicolás y Skarlett.</w:t>
       </w:r>
     </w:p>
     <w:p>
@@ -11508,7 +11508,7 @@
           <w:i w:val="0"/>
           <w:sz w:val="24"/>
         </w:rPr>
-        <w:t>Los operativos O1 a O4 sostienen ritmo y calidad del equipo. O5 a O7 miden si el piloto opera con datos creíbles y soporte atendible. E1 a E3 consolidan eso en cortes y EDT; E4 y E5 en techo y control de cambios.</w:t>
+        <w:t>Los operativos O1 a O4 sostienen ritmo y calidad del equipo. O5 a O7 miden si el piloto opera con datos creíbles y soporte atendible, incluido el efecto del chatbot sobre la carga de personal. E1 a E3 consolidan eso en cortes y EDT; E4 y E5 en techo y control de cambios.</w:t>
       </w:r>
     </w:p>
     <w:p>
@@ -12702,7 +12702,7 @@
               <w:jc w:val="left"/>
             </w:pPr>
             <w:r>
-              <w:t>Requisito. Copiloto de IA amplio o datalake completo.</w:t>
+              <w:t>Requisito. Chatbot amplio, app ciudadana o reemplazo total del soporte contratado; o datalake completo.</w:t>
             </w:r>
             <w:r>
               <w:rPr>
@@ -12881,7 +12881,7 @@
               <w:jc w:val="left"/>
             </w:pPr>
             <w:r>
-              <w:t>Requisito. IA fase 1 de soporte: resumen, checklist y siguiente ticket en cola.</w:t>
+              <w:t>Requisito. Chatbot fase 1: FAQ en la plataforma y canal de asistencia con escalamiento a ticket o persona.</w:t>
             </w:r>
             <w:r>
               <w:rPr>
@@ -12997,7 +12997,7 @@
               <w:jc w:val="left"/>
             </w:pPr>
             <w:r>
-              <w:t>Aprobado solo si C-06 o C-01b están en marcha, cabe en dos tarjetas y existe tope de API. Sin datos de hogares en un modelo externo. Escalamiento si proponen mover el 4 de diciembre.</w:t>
+              <w:t>Aprobado solo si C-06 está en marcha, cabe en dos tarjetas, existe tope de API y el FAQ está curado. Sin datos de hogares en un modelo externo. El bot no cierra ni cambia estados solo. Objetivo: ahorrar horas de soporte contratado. Escalamiento si proponen mover el 4 de diciembre o reemplazar de golpe al personal de soporte.</w:t>
             </w:r>
             <w:r>
               <w:rPr>
@@ -13388,7 +13388,7 @@
               <w:jc w:val="left"/>
             </w:pPr>
             <w:r>
-              <w:t>La prioridad y la nota de texto en el ticket, y solo si reemplazan una historia equivalente sin mover el 4 de diciembre. La regla de reasignación cuando un bloqueo supera cinco días. La priorización visual del tablero (C-06) y la IA fase 1 de soporte (C-05b), ambas condicionadas al reemplazo de historia, al límite de dos tarjetas y, en IA, al tope de API y al prerrequisito de cola.</w:t>
+              <w:t>La prioridad y la nota de texto en el ticket, y solo si reemplazan una historia equivalente sin mover el 4 de diciembre. La regla de reasignación cuando un bloqueo supera cinco días. La priorización visual del tablero (C-06) y el chatbot fase 1 de FAQ y canal de asistencia (C-05b), ambas condicionadas al reemplazo de historia, al límite de dos tarjetas y, en el chatbot, al tope de API, al FAQ curado y al prerrequisito de cola.</w:t>
             </w:r>
             <w:r>
               <w:rPr>
@@ -13452,7 +13452,7 @@
               <w:jc w:val="left"/>
             </w:pPr>
             <w:r>
-              <w:t>La fotografía del ticket, el segundo punto de inventario dentro de esta ventana, el servicio externo del reporte, el copiloto de IA amplio, el datalake o lakehouse completo, el modelo propio y las fases 2 y 3 de IA en esta ventana.</w:t>
+              <w:t>La fotografía del ticket, el segundo punto de inventario dentro de esta ventana, el servicio externo del reporte, el chatbot que reemplaza de golpe al soporte contratado, la app ciudadana masiva, el datalake o lakehouse completo, el modelo propio y las fases 2 y 3 del chatbot en esta ventana.</w:t>
             </w:r>
             <w:r>
               <w:rPr>
@@ -13514,7 +13514,7 @@
               <w:jc w:val="left"/>
             </w:pPr>
             <w:r>
-              <w:t>Kiran no instala paneles. Ninguna solicitud de este plan modifica ese límite. Tampoco abre una app ciudadana ni una plataforma analítica aparte del piloto.</w:t>
+              <w:t>Kiran no instala paneles. Ninguna solicitud de este plan modifica ese límite. Tampoco abre una app ciudadana masiva ni una plataforma analítica aparte del piloto. El chatbot fase 1 atiende a usuarios de la plataforma del piloto; no convierte a cada hogar en usuario de una app nueva.</w:t>
             </w:r>
             <w:r>
               <w:rPr>
@@ -13779,7 +13779,7 @@
           <w:i w:val="0"/>
           <w:sz w:val="24"/>
         </w:rPr>
-        <w:t>Proyecto: Kiran. Organización: caso semestral, Duoc UC, sede Puente Alto. Dirección del proyecto: Giannina Guerrero. Ventana: 14 de septiembre de 2026 al 9 de diciembre de 2026. Techo: US$ 20.700. Este documento es la versión vigente del análisis de cambios de la actividad 2.2.2. Las filas C-01a y C-03 nacen cerradas. Las filas C-01b, C-02 y C-04 nacen abiertas, con el alcance de decisión indicado en la Tabla 10. Registro ampliado con C-05a (cerrado), C-05b (abierto condicionado) y C-06 (abierto condicionado).</w:t>
+        <w:t>Proyecto: Kiran. Organización: caso semestral, Duoc UC, sede Puente Alto. Dirección del proyecto: Giannina Guerrero. Ventana: 14 de septiembre de 2026 al 9 de diciembre de 2026. Techo: US$ 20.700. Este documento es la versión vigente del análisis de cambios de la actividad 2.2.2. Las filas C-01a y C-03 nacen cerradas. Las filas C-01b, C-02 y C-04 nacen abiertas, con el alcance de decisión indicado en la Tabla 10. Registro ampliado con C-05a (chatbot amplio / app ciudadana / reemplazo total: cerrado), C-05b (FAQ + canal fase 1: abierto condicionado) y C-06 (abierto condicionado).</w:t>
       </w:r>
     </w:p>
     <w:sectPr>

</xml_diff>